<commit_message>
Update Payroll scenario Word document with Monthly Master Payroll Report and Individual Date-Range Report sections
</commit_message>
<xml_diff>
--- a/Word/Senario_Hoghoogh_Dastmozd.docx
+++ b/Word/Senario_Hoghoogh_Dastmozd.docx
@@ -1498,6 +1498,285 @@
     </w:tbl>
     <w:p>
       <w:pPr>
+        <w:bidi/>
+        <w:spacing w:before="320" w:after="160"/>
+        <w:jc w:val="right"/>
+      </w:pPr>
+      <w:r>
+        <w:rPr>
+          <w:rFonts w:ascii="B Yekan" w:hAnsi="B Yekan"/>
+          <w:b/>
+          <w:color w:val="2E7D32"/>
+          <w:sz w:val="30"/>
+        </w:rPr>
+        <w:t>۷. گزارش‌گیری جامع حقوق و دستمزد و گزارشات پرسنلی (Payroll Reports &amp; Analytics)</w:t>
+      </w:r>
+    </w:p>
+    <w:p>
+      <w:pPr>
+        <w:bidi/>
+        <w:spacing w:before="240" w:after="120"/>
+        <w:jc w:val="right"/>
+      </w:pPr>
+      <w:r>
+        <w:rPr>
+          <w:rFonts w:ascii="B Yekan" w:hAnsi="B Yekan"/>
+          <w:b/>
+          <w:color w:val="1565C0"/>
+          <w:sz w:val="26"/>
+        </w:rPr>
+        <w:t>۱. گزارش لیست حقوق و دستمزد ماهانه (Monthly Payroll Master List)</w:t>
+      </w:r>
+    </w:p>
+    <w:p>
+      <w:pPr>
+        <w:bidi/>
+        <w:spacing w:before="60" w:after="80" w:line="300" w:lineRule="auto"/>
+        <w:ind w:right="360"/>
+        <w:jc w:val="right"/>
+      </w:pPr>
+      <w:r>
+        <w:rPr>
+          <w:rFonts w:ascii="Tahoma" w:hAnsi="Tahoma"/>
+          <w:color w:val="2E7D32"/>
+          <w:sz w:val="20"/>
+        </w:rPr>
+        <w:t xml:space="preserve">▪ </w:t>
+      </w:r>
+      <w:r>
+        <w:rPr>
+          <w:rFonts w:ascii="B Nazanin" w:hAnsi="B Nazanin"/>
+          <w:b/>
+          <w:color w:val="1E2832"/>
+          <w:sz w:val="24"/>
+        </w:rPr>
+        <w:t xml:space="preserve">جدول خلاصه ماهانه: </w:t>
+      </w:r>
+      <w:r>
+        <w:rPr>
+          <w:rFonts w:ascii="B Nazanin" w:hAnsi="B Nazanin"/>
+          <w:color w:val="323C46"/>
+          <w:sz w:val="24"/>
+        </w:rPr>
+        <w:t>ارائه لیست جامع خلاصه حقوق ماهانه شامل کلیه پرسنل به همراه جزئیات روزهای کارکرد، اضافه کاری، حقوق پایه، حق مسکن، بن کارگری، حق اولاد، فوق‌العاده‌ها، کسورات (بیمه سهم پرسنل، مالیات، مساعده، اقساط وام) و خالص قابل پرداخت.</w:t>
+      </w:r>
+    </w:p>
+    <w:p>
+      <w:pPr>
+        <w:bidi/>
+        <w:spacing w:before="60" w:after="80" w:line="300" w:lineRule="auto"/>
+        <w:ind w:right="360"/>
+        <w:jc w:val="right"/>
+      </w:pPr>
+      <w:r>
+        <w:rPr>
+          <w:rFonts w:ascii="Tahoma" w:hAnsi="Tahoma"/>
+          <w:color w:val="2E7D32"/>
+          <w:sz w:val="20"/>
+        </w:rPr>
+        <w:t xml:space="preserve">▪ </w:t>
+      </w:r>
+      <w:r>
+        <w:rPr>
+          <w:rFonts w:ascii="B Nazanin" w:hAnsi="B Nazanin"/>
+          <w:b/>
+          <w:color w:val="1E2832"/>
+          <w:sz w:val="24"/>
+        </w:rPr>
+        <w:t xml:space="preserve">تفکیک دپارتمانی: </w:t>
+      </w:r>
+      <w:r>
+        <w:rPr>
+          <w:rFonts w:ascii="B Nazanin" w:hAnsi="B Nazanin"/>
+          <w:color w:val="323C46"/>
+          <w:sz w:val="24"/>
+        </w:rPr>
+        <w:t>امکان فیلتر بر اساس مرکز هزینه، واحد اداری/تولیدی، نوع قرارداد یا گروه شغلی پرسنل.</w:t>
+      </w:r>
+    </w:p>
+    <w:p>
+      <w:pPr>
+        <w:bidi/>
+        <w:spacing w:before="60" w:after="80" w:line="300" w:lineRule="auto"/>
+        <w:ind w:right="360"/>
+        <w:jc w:val="right"/>
+      </w:pPr>
+      <w:r>
+        <w:rPr>
+          <w:rFonts w:ascii="Tahoma" w:hAnsi="Tahoma"/>
+          <w:color w:val="2E7D32"/>
+          <w:sz w:val="20"/>
+        </w:rPr>
+        <w:t xml:space="preserve">▪ </w:t>
+      </w:r>
+      <w:r>
+        <w:rPr>
+          <w:rFonts w:ascii="B Nazanin" w:hAnsi="B Nazanin"/>
+          <w:b/>
+          <w:color w:val="1E2832"/>
+          <w:sz w:val="24"/>
+        </w:rPr>
+        <w:t xml:space="preserve">جمع‌های مدیریتی: </w:t>
+      </w:r>
+      <w:r>
+        <w:rPr>
+          <w:rFonts w:ascii="B Nazanin" w:hAnsi="B Nazanin"/>
+          <w:color w:val="323C46"/>
+          <w:sz w:val="24"/>
+        </w:rPr>
+        <w:t>نمایش سرجمع‌های تعهدات کارفرما شامل جمع بیمه ۲۳٪ (۲۰٪ کارفرما + ۳٪ بیکاری)، جمع مالیات تکلیفی و جمع کل بودجه حقوق ماهانه شرکت.</w:t>
+      </w:r>
+    </w:p>
+    <w:p>
+      <w:pPr>
+        <w:bidi/>
+        <w:spacing w:before="240" w:after="120"/>
+        <w:jc w:val="right"/>
+      </w:pPr>
+      <w:r>
+        <w:rPr>
+          <w:rFonts w:ascii="B Yekan" w:hAnsi="B Yekan"/>
+          <w:b/>
+          <w:color w:val="1565C0"/>
+          <w:sz w:val="26"/>
+        </w:rPr>
+        <w:t>۲. گزارش فردی پرسنل در بازه تاریخی دلخواه (Individual Employee Date-Range Report)</w:t>
+      </w:r>
+    </w:p>
+    <w:p>
+      <w:pPr>
+        <w:bidi/>
+        <w:spacing w:before="60" w:after="80" w:line="300" w:lineRule="auto"/>
+        <w:ind w:right="360"/>
+        <w:jc w:val="right"/>
+      </w:pPr>
+      <w:r>
+        <w:rPr>
+          <w:rFonts w:ascii="Tahoma" w:hAnsi="Tahoma"/>
+          <w:color w:val="2E7D32"/>
+          <w:sz w:val="20"/>
+        </w:rPr>
+        <w:t xml:space="preserve">▪ </w:t>
+      </w:r>
+      <w:r>
+        <w:rPr>
+          <w:rFonts w:ascii="B Nazanin" w:hAnsi="B Nazanin"/>
+          <w:b/>
+          <w:color w:val="1E2832"/>
+          <w:sz w:val="24"/>
+        </w:rPr>
+        <w:t xml:space="preserve">فیلتر فردی و تاریخی: </w:t>
+      </w:r>
+      <w:r>
+        <w:rPr>
+          <w:rFonts w:ascii="B Nazanin" w:hAnsi="B Nazanin"/>
+          <w:color w:val="323C46"/>
+          <w:sz w:val="24"/>
+        </w:rPr>
+        <w:t>امکان انتخاب یک پرسنل مشخص و تعیین بازه زمانی دلخواه (مثلاً از فروردین تا اسفند سال جاری، یا ۶ ماهه اخیر).</w:t>
+      </w:r>
+    </w:p>
+    <w:p>
+      <w:pPr>
+        <w:bidi/>
+        <w:spacing w:before="60" w:after="80" w:line="300" w:lineRule="auto"/>
+        <w:ind w:right="360"/>
+        <w:jc w:val="right"/>
+      </w:pPr>
+      <w:r>
+        <w:rPr>
+          <w:rFonts w:ascii="Tahoma" w:hAnsi="Tahoma"/>
+          <w:color w:val="2E7D32"/>
+          <w:sz w:val="20"/>
+        </w:rPr>
+        <w:t xml:space="preserve">▪ </w:t>
+      </w:r>
+      <w:r>
+        <w:rPr>
+          <w:rFonts w:ascii="B Nazanin" w:hAnsi="B Nazanin"/>
+          <w:b/>
+          <w:color w:val="1E2832"/>
+          <w:sz w:val="24"/>
+        </w:rPr>
+        <w:t xml:space="preserve">روند ماهانه پرسنل: </w:t>
+      </w:r>
+      <w:r>
+        <w:rPr>
+          <w:rFonts w:ascii="B Nazanin" w:hAnsi="B Nazanin"/>
+          <w:color w:val="323C46"/>
+          <w:sz w:val="24"/>
+        </w:rPr>
+        <w:t>نمایش ماتریسی ماه به ماه کارکرد، حقوق ناخالص، اضافه کاری، بیمه کسرشده، مالیات پرداختی، مساعده‌ها و خالص دریافتی آن کارمند طی دوره مشخص‌شده.</w:t>
+      </w:r>
+    </w:p>
+    <w:p>
+      <w:pPr>
+        <w:bidi/>
+        <w:spacing w:before="60" w:after="80" w:line="300" w:lineRule="auto"/>
+        <w:ind w:right="360"/>
+        <w:jc w:val="right"/>
+      </w:pPr>
+      <w:r>
+        <w:rPr>
+          <w:rFonts w:ascii="Tahoma" w:hAnsi="Tahoma"/>
+          <w:color w:val="2E7D32"/>
+          <w:sz w:val="20"/>
+        </w:rPr>
+        <w:t xml:space="preserve">▪ </w:t>
+      </w:r>
+      <w:r>
+        <w:rPr>
+          <w:rFonts w:ascii="B Nazanin" w:hAnsi="B Nazanin"/>
+          <w:b/>
+          <w:color w:val="1E2832"/>
+          <w:sz w:val="24"/>
+        </w:rPr>
+        <w:t xml:space="preserve">تحلیل سوابق و مانده مرخصی: </w:t>
+      </w:r>
+      <w:r>
+        <w:rPr>
+          <w:rFonts w:ascii="B Nazanin" w:hAnsi="B Nazanin"/>
+          <w:color w:val="323C46"/>
+          <w:sz w:val="24"/>
+        </w:rPr>
+        <w:t>نمایش کاردکس مرخصی (مانده استحقاقی، مرخصی‌های استفاده شده و مانده قابل بازخرید در پایان سال)، خلاصه مانده وام‌ها و مساعده‌های پرسنل.</w:t>
+      </w:r>
+    </w:p>
+    <w:p>
+      <w:pPr>
+        <w:bidi/>
+        <w:spacing w:before="60" w:after="80" w:line="300" w:lineRule="auto"/>
+        <w:ind w:right="360"/>
+        <w:jc w:val="right"/>
+      </w:pPr>
+      <w:r>
+        <w:rPr>
+          <w:rFonts w:ascii="Tahoma" w:hAnsi="Tahoma"/>
+          <w:color w:val="2E7D32"/>
+          <w:sz w:val="20"/>
+        </w:rPr>
+        <w:t xml:space="preserve">▪ </w:t>
+      </w:r>
+      <w:r>
+        <w:rPr>
+          <w:rFonts w:ascii="B Nazanin" w:hAnsi="B Nazanin"/>
+          <w:b/>
+          <w:color w:val="1E2832"/>
+          <w:sz w:val="24"/>
+        </w:rPr>
+        <w:t xml:space="preserve">چاپ رسمی و خروجی اکسل: </w:t>
+      </w:r>
+      <w:r>
+        <w:rPr>
+          <w:rFonts w:ascii="B Nazanin" w:hAnsi="B Nazanin"/>
+          <w:color w:val="323C46"/>
+          <w:sz w:val="24"/>
+        </w:rPr>
+        <w:t>قابلیت چاپ رسمی پرونده حقوقی پرسنل، خروجی اکسل و نمودار مقایسه‌ای روند دریافتی کارمند طی ماه‌های مختلف سال.</w:t>
+      </w:r>
+    </w:p>
+    <w:p>
+      <w:pPr>
         <w:spacing w:before="120"/>
       </w:pPr>
     </w:p>
@@ -1554,6 +1833,8 @@
               <w:t>۳. صدور دیسکت‌های بیمه تامین اجتماعی و دیسکت مالیات و فایل پرداخت بانکی پایا.</w:t>
               <w:br/>
               <w:t>۴. صدور خودکار سند حسابداری حقوق ماهانه با قفل عدم ویرایش از حسابداری جهت حفظ تطبیق مالی.</w:t>
+              <w:br/>
+              <w:t>۵. گزارش‌گیری جامع ماهانه شرکت و گزارش خلاصه سوابق فردی پرسنل در بازه تاریخی دلخواه با خروجی چاپی و اکسل.</w:t>
             </w:r>
           </w:p>
         </w:tc>

</xml_diff>